<commit_message>
Revisions to update the project description tabs.
</commit_message>
<xml_diff>
--- a/biochar_app/markdown/docx/experimentDesign.docx
+++ b/biochar_app/markdown/docx/experimentDesign.docx
@@ -29,7 +29,13 @@
         <w:t xml:space="preserve"> available in the biochar pores</w:t>
       </w:r>
       <w:r>
-        <w:t xml:space="preserve"> where water, nutrients, and soil biota can be stored. In a desert environment like that around Fruita, water shortages can be a big problem. The primary </w:t>
+        <w:t xml:space="preserve"> where water, nutrients, and soil biota can be stored. In a desert environment like that around Fruita, </w:t>
+      </w:r>
+      <w:r>
+        <w:t xml:space="preserve">Colorado, </w:t>
+      </w:r>
+      <w:r>
+        <w:t xml:space="preserve">water shortages can be a big problem. The primary </w:t>
       </w:r>
       <w:r>
         <w:t>research q</w:t>
@@ -462,6 +468,9 @@
             <w:r>
               <w:t xml:space="preserve"> April 2</w:t>
             </w:r>
+            <w:r>
+              <w:t>, November 3</w:t>
+            </w:r>
           </w:p>
         </w:tc>
       </w:tr>
@@ -480,6 +489,9 @@
     <w:p>
       <w:r>
         <w:t>The Ward Labs fertilizer recommendations based on the soil samples for each strip were followed.</w:t>
+      </w:r>
+      <w:r>
+        <w:t xml:space="preserve"> Data on timing and quantity are available on the Bulk Downloads tab.</w:t>
       </w:r>
     </w:p>
     <w:p>
@@ -498,7 +510,30 @@
     </w:p>
     <w:p>
       <w:r>
-        <w:t>Coming soon.</w:t>
+        <w:t>Grasses were harvested three times a season in each of the four strips with measurements on dried biomass content and analyzed for nutrient composition by strip (Pasture Quality Metrics and Biomass (Field Samples) tabs</w:t>
+      </w:r>
+      <w:r>
+        <w:t>.</w:t>
+      </w:r>
+      <w:r>
+        <w:br/>
+      </w:r>
+      <w:r>
+        <w:br/>
+      </w:r>
+      <w:r>
+        <w:rPr>
+          <w:rStyle w:val="Heading1Char"/>
+          <w:rFonts w:ascii="Times New Roman" w:hAnsi="Times New Roman" w:cs="Times New Roman"/>
+          <w:sz w:val="32"/>
+          <w:szCs w:val="32"/>
+        </w:rPr>
+        <w:t>Soil Chemistry and Biological Activity</w:t>
+      </w:r>
+    </w:p>
+    <w:p>
+      <w:r>
+        <w:t>Soil samples were collected in each strip twice a year, in the spring and fall. The data were sent to Ward Labs for testing for both chemical composition and biological activity (Soil Biological Health and Soil Chemistry tabs. As with all the data presented here, these data can be downloaded using the Bulk Downloads tab.</w:t>
       </w:r>
     </w:p>
     <w:sectPr>

</xml_diff>

<commit_message>
Updating a range of files.
</commit_message>
<xml_diff>
--- a/biochar_app/markdown/docx/experimentDesign.docx
+++ b/biochar_app/markdown/docx/experimentDesign.docx
@@ -127,10 +127,10 @@
           <w:noProof/>
         </w:rPr>
         <w:drawing>
-          <wp:inline distT="0" distB="0" distL="0" distR="0" wp14:anchorId="68BE07D6" wp14:editId="6F774C7E">
-            <wp:extent cx="3200400" cy="3995130"/>
-            <wp:effectExtent l="0" t="0" r="0" b="5715"/>
-            <wp:docPr id="1840529377" name="Picture 1" descr="A screenshot of a computer screen&#10;&#10;AI-generated content may be incorrect."/>
+          <wp:inline distT="0" distB="0" distL="0" distR="0" wp14:anchorId="68BE07D6" wp14:editId="1F96B170">
+            <wp:extent cx="1972903" cy="3995130"/>
+            <wp:effectExtent l="0" t="0" r="0" b="0"/>
+            <wp:docPr id="1840529377" name="Picture 1"/>
             <wp:cNvGraphicFramePr>
               <a:graphicFrameLocks xmlns:a="http://schemas.openxmlformats.org/drawingml/2006/main" noChangeAspect="1"/>
             </wp:cNvGraphicFramePr>
@@ -138,7 +138,7 @@
               <a:graphicData uri="http://schemas.openxmlformats.org/drawingml/2006/picture">
                 <pic:pic xmlns:pic="http://schemas.openxmlformats.org/drawingml/2006/picture">
                   <pic:nvPicPr>
-                    <pic:cNvPr id="1840529377" name="Picture 1" descr="A screenshot of a computer screen&#10;&#10;AI-generated content may be incorrect."/>
+                    <pic:cNvPr id="1840529377" name="Picture 1"/>
                     <pic:cNvPicPr/>
                   </pic:nvPicPr>
                   <pic:blipFill>
@@ -156,7 +156,7 @@
                   <pic:spPr>
                     <a:xfrm>
                       <a:off x="0" y="0"/>
-                      <a:ext cx="3213814" cy="4011875"/>
+                      <a:ext cx="1972903" cy="3995130"/>
                     </a:xfrm>
                     <a:prstGeom prst="rect">
                       <a:avLst/>
@@ -272,10 +272,10 @@
           <w:noProof/>
         </w:rPr>
         <w:drawing>
-          <wp:inline distT="0" distB="0" distL="0" distR="0" wp14:anchorId="7EFB7875" wp14:editId="10490D14">
-            <wp:extent cx="3666744" cy="3355848"/>
+          <wp:inline distT="0" distB="0" distL="0" distR="0" wp14:anchorId="7EFB7875" wp14:editId="08D2F1E6">
+            <wp:extent cx="3666744" cy="3355535"/>
             <wp:effectExtent l="0" t="0" r="3810" b="0"/>
-            <wp:docPr id="1802139394" name="Picture 2" descr="Pistacchio shell biochar.&#10;"/>
+            <wp:docPr id="1802139394" name="Picture 2"/>
             <wp:cNvGraphicFramePr>
               <a:graphicFrameLocks xmlns:a="http://schemas.openxmlformats.org/drawingml/2006/main" noChangeAspect="1"/>
             </wp:cNvGraphicFramePr>
@@ -283,7 +283,7 @@
               <a:graphicData uri="http://schemas.openxmlformats.org/drawingml/2006/picture">
                 <pic:pic xmlns:pic="http://schemas.openxmlformats.org/drawingml/2006/picture">
                   <pic:nvPicPr>
-                    <pic:cNvPr id="1802139394" name="Picture 2" descr="Pistacchio shell biochar.&#10;"/>
+                    <pic:cNvPr id="1802139394" name="Picture 2"/>
                     <pic:cNvPicPr/>
                   </pic:nvPicPr>
                   <pic:blipFill>
@@ -301,7 +301,7 @@
                   <pic:spPr>
                     <a:xfrm>
                       <a:off x="0" y="0"/>
-                      <a:ext cx="3666744" cy="3355848"/>
+                      <a:ext cx="3666744" cy="3355535"/>
                     </a:xfrm>
                     <a:prstGeom prst="rect">
                       <a:avLst/>

</xml_diff>

<commit_message>
Refactor Word content conversion and update configuration metadata
</commit_message>
<xml_diff>
--- a/biochar_app/markdown/docx/experimentDesign.docx
+++ b/biochar_app/markdown/docx/experimentDesign.docx
@@ -1,16 +1,28 @@
 
 <file path=word/document.xml><?xml version="1.0" encoding="utf-8"?>
-<w:document xmlns:wpc="http://schemas.microsoft.com/office/word/2010/wordprocessingCanvas" xmlns:cx="http://schemas.microsoft.com/office/drawing/2014/chartex" xmlns:cx1="http://schemas.microsoft.com/office/drawing/2015/9/8/chartex" xmlns:cx2="http://schemas.microsoft.com/office/drawing/2015/10/21/chartex" xmlns:cx3="http://schemas.microsoft.com/office/drawing/2016/5/9/chartex" xmlns:cx4="http://schemas.microsoft.com/office/drawing/2016/5/10/chartex" xmlns:cx5="http://schemas.microsoft.com/office/drawing/2016/5/11/chartex" xmlns:cx6="http://schemas.microsoft.com/office/drawing/2016/5/12/chartex" xmlns:cx7="http://schemas.microsoft.com/office/drawing/2016/5/13/chartex" xmlns:cx8="http://schemas.microsoft.com/office/drawing/2016/5/14/chartex" xmlns:mc="http://schemas.openxmlformats.org/markup-compatibility/2006" xmlns:aink="http://schemas.microsoft.com/office/drawing/2016/ink" xmlns:am3d="http://schemas.microsoft.com/office/drawing/2017/model3d" xmlns:o="urn:schemas-microsoft-com:office:office" xmlns:oel="http://schemas.microsoft.com/office/2019/extlst" xmlns:r="http://schemas.openxmlformats.org/officeDocument/2006/relationships" xmlns:m="http://schemas.openxmlformats.org/officeDocument/2006/math" xmlns:v="urn:schemas-microsoft-com:vml" xmlns:wp14="http://schemas.microsoft.com/office/word/2010/wordprocessingDrawing" xmlns:wp="http://schemas.openxmlformats.org/drawingml/2006/wordprocessingDrawing" xmlns:w10="urn:schemas-microsoft-com:office:word" xmlns:w="http://schemas.openxmlformats.org/wordprocessingml/2006/main" xmlns:w14="http://schemas.microsoft.com/office/word/2010/wordml" xmlns:w15="http://schemas.microsoft.com/office/word/2012/wordml" xmlns:w16cex="http://schemas.microsoft.com/office/word/2018/wordml/cex" xmlns:w16cid="http://schemas.microsoft.com/office/word/2016/wordml/cid" xmlns:w16="http://schemas.microsoft.com/office/word/2018/wordml" xmlns:w16du="http://schemas.microsoft.com/office/word/2023/wordml/word16du" xmlns:w16sdtdh="http://schemas.microsoft.com/office/word/2020/wordml/sdtdatahash" xmlns:w16sdtfl="http://schemas.microsoft.com/office/word/2024/wordml/sdtformatlock" xmlns:w16se="http://schemas.microsoft.com/office/word/2015/wordml/symex" xmlns:wpg="http://schemas.microsoft.com/office/word/2010/wordprocessingGroup" xmlns:wpi="http://schemas.microsoft.com/office/word/2010/wordprocessingInk" xmlns:wne="http://schemas.microsoft.com/office/word/2006/wordml" xmlns:wps="http://schemas.microsoft.com/office/word/2010/wordprocessingShape" mc:Ignorable="w14 w15 w16se w16cid w16 w16cex w16sdtdh w16sdtfl w16du wp14">
+<w:document xmlns:wpc="http://schemas.microsoft.com/office/word/2010/wordprocessingCanvas" xmlns:cx="http://schemas.microsoft.com/office/drawing/2014/chartex" xmlns:cx1="http://schemas.microsoft.com/office/drawing/2015/9/8/chartex" xmlns:cx2="http://schemas.microsoft.com/office/drawing/2015/10/21/chartex" xmlns:cx3="http://schemas.microsoft.com/office/drawing/2016/5/9/chartex" xmlns:cx4="http://schemas.microsoft.com/office/drawing/2016/5/10/chartex" xmlns:cx5="http://schemas.microsoft.com/office/drawing/2016/5/11/chartex" xmlns:cx6="http://schemas.microsoft.com/office/drawing/2016/5/12/chartex" xmlns:cx7="http://schemas.microsoft.com/office/drawing/2016/5/13/chartex" xmlns:cx8="http://schemas.microsoft.com/office/drawing/2016/5/14/chartex" xmlns:mc="http://schemas.openxmlformats.org/markup-compatibility/2006" xmlns:m="http://schemas.openxmlformats.org/officeDocument/2006/math" xmlns:aink="http://schemas.microsoft.com/office/drawing/2016/ink" xmlns:am3d="http://schemas.microsoft.com/office/drawing/2017/model3d" xmlns:oel="http://schemas.microsoft.com/office/2019/extlst" xmlns:r="http://schemas.openxmlformats.org/officeDocument/2006/relationships" xmlns:wp14="http://schemas.microsoft.com/office/word/2010/wordprocessingDrawing" xmlns:wp="http://schemas.openxmlformats.org/drawingml/2006/wordprocessingDrawing" xmlns:wpg="http://schemas.microsoft.com/office/word/2010/wordprocessingGroup" xmlns:wpi="http://schemas.microsoft.com/office/word/2010/wordprocessingInk" xmlns:wps="http://schemas.microsoft.com/office/word/2010/wordprocessingShape" xmlns:o="urn:schemas-microsoft-com:office:office" xmlns:v="urn:schemas-microsoft-com:vml" xmlns:w10="urn:schemas-microsoft-com:office:word" xmlns:w="http://schemas.openxmlformats.org/wordprocessingml/2006/main" xmlns:w14="http://schemas.microsoft.com/office/word/2010/wordml" xmlns:w15="http://schemas.microsoft.com/office/word/2012/wordml" xmlns:w16cex="http://schemas.microsoft.com/office/word/2018/wordml/cex" xmlns:w16cid="http://schemas.microsoft.com/office/word/2016/wordml/cid" xmlns:w16="http://schemas.microsoft.com/office/word/2018/wordml" xmlns:w16sdtdh="http://schemas.microsoft.com/office/word/2020/wordml/sdtdatahash" xmlns:w16sdtfl="http://schemas.microsoft.com/office/word/2024/wordml/sdtformatlock" xmlns:w16se="http://schemas.microsoft.com/office/word/2015/wordml/symex" xmlns:w16du="http://schemas.microsoft.com/office/word/2023/wordml/word16du" xmlns:wne="http://schemas.microsoft.com/office/word/2006/wordml" mc:Ignorable="w14 w15 w16se w16cid w16 w16cex w16sdtdh w16sdtfl w16du wp14">
   <w:body>
     <w:p>
       <w:pPr>
         <w:pStyle w:val="Heading1"/>
       </w:pPr>
       <w:r>
-        <w:t>The Biochar Experiment</w:t>
-      </w:r>
-      <w:r>
-        <w:t>al Design</w:t>
+        <w:t xml:space="preserve">The </w:t>
+      </w:r>
+      <w:r>
+        <w:t xml:space="preserve">Fruita </w:t>
+      </w:r>
+      <w:r>
+        <w:t xml:space="preserve">Biochar </w:t>
+      </w:r>
+      <w:r>
+        <w:t xml:space="preserve">Project </w:t>
+      </w:r>
+      <w:r>
+        <w:t>Experiment</w:t>
+      </w:r>
+      <w:r>
+        <w:t xml:space="preserve"> Design</w:t>
       </w:r>
     </w:p>
     <w:p>
@@ -18,7 +30,7 @@
         <w:pStyle w:val="Heading2"/>
       </w:pPr>
       <w:r>
-        <w:t>Hypotheses to be tested</w:t>
+        <w:t>Research Questions</w:t>
       </w:r>
     </w:p>
     <w:p>
@@ -35,7 +47,12 @@
         <w:t xml:space="preserve">Colorado, </w:t>
       </w:r>
       <w:r>
-        <w:t xml:space="preserve">water shortages can be a big problem. The primary </w:t>
+        <w:t xml:space="preserve">water shortages can be a big problem. </w:t>
+      </w:r>
+    </w:p>
+    <w:p>
+      <w:r>
+        <w:t xml:space="preserve">The primary </w:t>
       </w:r>
       <w:r>
         <w:t>research q</w:t>
@@ -50,7 +67,13 @@
         <w:t>in a field</w:t>
       </w:r>
       <w:r>
-        <w:t xml:space="preserve"> without and for how long. A second research question is what </w:t>
+        <w:t xml:space="preserve"> without</w:t>
+      </w:r>
+      <w:r>
+        <w:t xml:space="preserve">, </w:t>
+      </w:r>
+      <w:r>
+        <w:t xml:space="preserve">and for how long. A second research question is what </w:t>
       </w:r>
       <w:proofErr w:type="gramStart"/>
       <w:r>
@@ -61,13 +84,31 @@
       </w:r>
       <w:proofErr w:type="gramEnd"/>
       <w:r>
-        <w:t xml:space="preserve"> to quantity and quality of pasture production. A third topic is do the benefits of having biochar in the </w:t>
+        <w:t xml:space="preserve"> to quantity and quality of pasture production. A third </w:t>
+      </w:r>
+      <w:r>
+        <w:t>question</w:t>
+      </w:r>
+      <w:r>
+        <w:t xml:space="preserve"> is </w:t>
+      </w:r>
+      <w:r>
+        <w:t xml:space="preserve">how long </w:t>
+      </w:r>
+      <w:r>
+        <w:t xml:space="preserve">do the benefits of having biochar in the </w:t>
       </w:r>
       <w:r>
         <w:t>soil</w:t>
       </w:r>
       <w:r>
-        <w:t xml:space="preserve"> last for multiple years. </w:t>
+        <w:t xml:space="preserve"> last</w:t>
+      </w:r>
+      <w:r>
+        <w:t>?</w:t>
+      </w:r>
+      <w:r>
+        <w:t xml:space="preserve"> </w:t>
       </w:r>
     </w:p>
     <w:p>
@@ -84,7 +125,25 @@
         <w:t>.</w:t>
       </w:r>
       <w:r>
-        <w:t xml:space="preserve"> This writeup covers the period from 2023 to the end of 2025.</w:t>
+        <w:t xml:space="preserve"> This </w:t>
+      </w:r>
+      <w:r>
+        <w:t>website</w:t>
+      </w:r>
+      <w:r>
+        <w:t xml:space="preserve"> covers the period from 2023 </w:t>
+      </w:r>
+      <w:r>
+        <w:t>through</w:t>
+      </w:r>
+      <w:r>
+        <w:t xml:space="preserve"> </w:t>
+      </w:r>
+      <w:r>
+        <w:t>2026</w:t>
+      </w:r>
+      <w:r>
+        <w:t>.</w:t>
       </w:r>
     </w:p>
     <w:p>
@@ -127,9 +186,9 @@
           <w:noProof/>
         </w:rPr>
         <w:drawing>
-          <wp:inline distT="0" distB="0" distL="0" distR="0" wp14:anchorId="68BE07D6" wp14:editId="1F96B170">
-            <wp:extent cx="1972903" cy="3995130"/>
-            <wp:effectExtent l="0" t="0" r="0" b="0"/>
+          <wp:inline distT="0" distB="0" distL="0" distR="0" wp14:anchorId="68BE07D6" wp14:editId="212274D4">
+            <wp:extent cx="1972903" cy="3096142"/>
+            <wp:effectExtent l="0" t="0" r="0" b="3175"/>
             <wp:docPr id="1840529377" name="Picture 1"/>
             <wp:cNvGraphicFramePr>
               <a:graphicFrameLocks xmlns:a="http://schemas.openxmlformats.org/drawingml/2006/main" noChangeAspect="1"/>
@@ -156,7 +215,7 @@
                   <pic:spPr>
                     <a:xfrm>
                       <a:off x="0" y="0"/>
-                      <a:ext cx="1972903" cy="3995130"/>
+                      <a:ext cx="1972903" cy="3096142"/>
                     </a:xfrm>
                     <a:prstGeom prst="rect">
                       <a:avLst/>
@@ -190,20 +249,28 @@
     </w:p>
     <w:p>
       <w:r>
-        <w:lastRenderedPageBreak/>
         <w:t xml:space="preserve">In spring 2023, </w:t>
       </w:r>
       <w:r>
         <w:t xml:space="preserve">biochar was injected into </w:t>
       </w:r>
       <w:r>
-        <w:t>strips 1 and 3 every 6 inches to an approximate depth of 6 inches.</w:t>
+        <w:t xml:space="preserve">strips 1 and 3 every 6 inches to an approximate depth of 6 </w:t>
+      </w:r>
+      <w:r>
+        <w:t xml:space="preserve">to 8 </w:t>
+      </w:r>
+      <w:r>
+        <w:t>inches.</w:t>
       </w:r>
       <w:r>
         <w:t xml:space="preserve"> </w:t>
       </w:r>
       <w:r>
         <w:t>Strips 2 and 4 had no biochar amendment.</w:t>
+      </w:r>
+      <w:r>
+        <w:t xml:space="preserve"> No further biochar applications were made.</w:t>
       </w:r>
     </w:p>
     <w:p>
@@ -211,20 +278,70 @@
         <w:pStyle w:val="Heading2"/>
       </w:pPr>
       <w:r>
+        <w:lastRenderedPageBreak/>
         <w:t>Irrigation</w:t>
       </w:r>
-    </w:p>
-    <w:p>
+      <w:r>
+        <w:t xml:space="preserve"> is the source of water</w:t>
+      </w:r>
+    </w:p>
+    <w:p>
+      <w:r>
+        <w:t>Average rainfall in the area is about 9 inches (23 cm</w:t>
+      </w:r>
+      <w:proofErr w:type="gramStart"/>
+      <w:r>
+        <w:t>)</w:t>
+      </w:r>
+      <w:proofErr w:type="gramEnd"/>
+      <w:r>
+        <w:t xml:space="preserve"> so irrigation is essential. </w:t>
+      </w:r>
       <w:r>
         <w:t>Water</w:t>
       </w:r>
       <w:r>
-        <w:t xml:space="preserve"> for the field is done using furrow irrigation, with the furrows 30 inches apart. Irrigation water is applied at the north end (top of the image) and runs down the furrows, infiltrating into the soil until it is saturated. Any excess runs into a drainage ditch at the south end of the field.</w:t>
-      </w:r>
-    </w:p>
-    <w:p>
-      <w:r>
-        <w:t xml:space="preserve">Irrigation is applied to the east two rows (strips 3 and 4) roughly every two weeks during the growing season. The </w:t>
+        <w:t xml:space="preserve"> for the field</w:t>
+      </w:r>
+      <w:r>
+        <w:t xml:space="preserve"> comes from Color</w:t>
+      </w:r>
+      <w:r>
+        <w:t>a</w:t>
+      </w:r>
+      <w:r>
+        <w:t xml:space="preserve">do River via the </w:t>
+      </w:r>
+      <w:hyperlink r:id="rId5" w:history="1">
+        <w:r>
+          <w:rPr>
+            <w:rStyle w:val="Hyperlink"/>
+          </w:rPr>
+          <w:t>Highline Canal</w:t>
+        </w:r>
+      </w:hyperlink>
+      <w:r>
+        <w:t xml:space="preserve">. Water is applied </w:t>
+      </w:r>
+      <w:r>
+        <w:t>using furrow irrigation, with the furrows 30 inches apart. Irrigation water is applied at the north end (top of the image) and runs down the furrows, infiltrating into the soil</w:t>
+      </w:r>
+      <w:r>
+        <w:t xml:space="preserve"> (see figure below).</w:t>
+      </w:r>
+      <w:r>
+        <w:t xml:space="preserve"> Any excess runs into a drainage ditch at the south end of the field.</w:t>
+      </w:r>
+    </w:p>
+    <w:p>
+      <w:r>
+        <w:t xml:space="preserve">Irrigation is applied to the </w:t>
+      </w:r>
+      <w:r>
+        <w:t>east</w:t>
+      </w:r>
+      <w:r>
+        <w:t xml:space="preserve"> two rows (strips 3 and 4) roughly every two weeks during the growing season. The </w:t>
       </w:r>
       <w:r>
         <w:t xml:space="preserve">two </w:t>
@@ -245,7 +362,7 @@
       <w:r>
         <w:t xml:space="preserve">The biochar used in this experiment is made from pistachio shells and was purchased from </w:t>
       </w:r>
-      <w:hyperlink r:id="rId5" w:history="1">
+      <w:hyperlink r:id="rId6" w:history="1">
         <w:r>
           <w:rPr>
             <w:rStyle w:val="Hyperlink"/>
@@ -254,13 +371,10 @@
         </w:r>
       </w:hyperlink>
       <w:r>
-        <w:t xml:space="preserve">, Camarillo, California. More details and chemical analysis results </w:t>
-      </w:r>
-      <w:r>
-        <w:t>will be</w:t>
-      </w:r>
-      <w:r>
-        <w:t xml:space="preserve"> available in the Additional Information tab.</w:t>
+        <w:t xml:space="preserve">, Camarillo, California. </w:t>
+      </w:r>
+      <w:r>
+        <w:t>Laboratory analyses of the biochar are available in the Biochar Material Characterization tab under Lab-Based Results.</w:t>
       </w:r>
     </w:p>
     <w:p>
@@ -287,7 +401,7 @@
                     <pic:cNvPicPr/>
                   </pic:nvPicPr>
                   <pic:blipFill>
-                    <a:blip r:embed="rId6" cstate="print">
+                    <a:blip r:embed="rId7" cstate="print">
                       <a:extLst>
                         <a:ext uri="{28A0092B-C50C-407E-A947-70E740481C1C}">
                           <a14:useLocalDpi xmlns:a14="http://schemas.microsoft.com/office/drawing/2010/main" val="0"/>
@@ -334,15 +448,135 @@
       </w:r>
     </w:p>
     <w:p>
-      <w:r>
-        <w:t>The process to collect soil moisture, electrical conductivity, and temperature is described in detail in the Technical Details tab.</w:t>
-      </w:r>
-    </w:p>
-    <w:p>
       <w:pPr>
         <w:pStyle w:val="Heading2"/>
       </w:pPr>
       <w:r>
+        <w:lastRenderedPageBreak/>
+        <w:t>Irrigation data collection</w:t>
+      </w:r>
+    </w:p>
+    <w:p>
+      <w:pPr>
+        <w:keepNext/>
+      </w:pPr>
+      <w:r>
+        <w:t xml:space="preserve">Data on the consequences of irrigation in soil </w:t>
+      </w:r>
+      <w:r>
+        <w:t xml:space="preserve">– </w:t>
+      </w:r>
+      <w:r>
+        <w:t xml:space="preserve">soil moisture, electrical conductivity, and temperature </w:t>
+      </w:r>
+      <w:r>
+        <w:t xml:space="preserve">– is </w:t>
+      </w:r>
+      <w:r>
+        <w:t>collected</w:t>
+      </w:r>
+      <w:r>
+        <w:t xml:space="preserve"> using Campbell Scientific CS650 probes located 6, 12, and 18 inches below the surface</w:t>
+      </w:r>
+      <w:r>
+        <w:t>. The process</w:t>
+      </w:r>
+      <w:r>
+        <w:t xml:space="preserve"> </w:t>
+      </w:r>
+      <w:r>
+        <w:t>is described in detail in the Technical Details tab.</w:t>
+      </w:r>
+      <w:r>
+        <w:t xml:space="preserve"> </w:t>
+      </w:r>
+    </w:p>
+    <w:p>
+      <w:pPr>
+        <w:keepNext/>
+      </w:pPr>
+      <w:r>
+        <w:drawing>
+          <wp:inline distT="0" distB="0" distL="0" distR="0" wp14:anchorId="38B7C73B" wp14:editId="69B0F41B">
+            <wp:extent cx="2267028" cy="2992476"/>
+            <wp:effectExtent l="0" t="0" r="0" b="5080"/>
+            <wp:docPr id="7" name="Image13">
+              <a:extLst xmlns:a="http://schemas.openxmlformats.org/drawingml/2006/main">
+                <a:ext uri="{FF2B5EF4-FFF2-40B4-BE49-F238E27FC236}">
+                  <a16:creationId xmlns:a16="http://schemas.microsoft.com/office/drawing/2014/main" id="{A8F63CAA-1D35-CD45-D8C6-A490F604E565}"/>
+                </a:ext>
+              </a:extLst>
+            </wp:docPr>
+            <wp:cNvGraphicFramePr>
+              <a:graphicFrameLocks xmlns:a="http://schemas.openxmlformats.org/drawingml/2006/main" noChangeAspect="1"/>
+            </wp:cNvGraphicFramePr>
+            <a:graphic xmlns:a="http://schemas.openxmlformats.org/drawingml/2006/main">
+              <a:graphicData uri="http://schemas.openxmlformats.org/drawingml/2006/picture">
+                <pic:pic xmlns:pic="http://schemas.openxmlformats.org/drawingml/2006/picture">
+                  <pic:nvPicPr>
+                    <pic:cNvPr id="7" name="Image13">
+                      <a:extLst>
+                        <a:ext uri="{FF2B5EF4-FFF2-40B4-BE49-F238E27FC236}">
+                          <a16:creationId xmlns:a16="http://schemas.microsoft.com/office/drawing/2014/main" id="{A8F63CAA-1D35-CD45-D8C6-A490F604E565}"/>
+                        </a:ext>
+                      </a:extLst>
+                    </pic:cNvPr>
+                    <pic:cNvPicPr>
+                      <a:picLocks noChangeAspect="1"/>
+                    </pic:cNvPicPr>
+                  </pic:nvPicPr>
+                  <pic:blipFill>
+                    <a:blip r:embed="rId8" cstate="print">
+                      <a:extLst>
+                        <a:ext uri="{28A0092B-C50C-407E-A947-70E740481C1C}">
+                          <a14:useLocalDpi xmlns:a14="http://schemas.microsoft.com/office/drawing/2010/main" val="0"/>
+                        </a:ext>
+                      </a:extLst>
+                    </a:blip>
+                    <a:stretch>
+                      <a:fillRect/>
+                    </a:stretch>
+                  </pic:blipFill>
+                  <pic:spPr bwMode="auto">
+                    <a:xfrm>
+                      <a:off x="0" y="0"/>
+                      <a:ext cx="2267028" cy="2992476"/>
+                    </a:xfrm>
+                    <a:prstGeom prst="rect">
+                      <a:avLst/>
+                    </a:prstGeom>
+                  </pic:spPr>
+                </pic:pic>
+              </a:graphicData>
+            </a:graphic>
+          </wp:inline>
+        </w:drawing>
+      </w:r>
+    </w:p>
+    <w:p>
+      <w:pPr>
+        <w:pStyle w:val="Caption"/>
+      </w:pPr>
+      <w:r>
+        <w:t xml:space="preserve">Figure </w:t>
+      </w:r>
+      <w:fldSimple w:instr=" SEQ Figure \* ARABIC ">
+        <w:r>
+          <w:rPr>
+            <w:noProof/>
+          </w:rPr>
+          <w:t>3</w:t>
+        </w:r>
+      </w:fldSimple>
+      <w:r>
+        <w:t>. CS650 probes in place</w:t>
+      </w:r>
+    </w:p>
+    <w:p>
+      <w:pPr>
+        <w:pStyle w:val="Heading2"/>
+      </w:pPr>
+      <w:r>
         <w:t>Soil sampling</w:t>
       </w:r>
     </w:p>
@@ -356,7 +590,7 @@
       <w:r>
         <w:t xml:space="preserve"> collected in early spring and late fall and analyzed by </w:t>
       </w:r>
-      <w:hyperlink r:id="rId7" w:history="1">
+      <w:hyperlink r:id="rId9" w:history="1">
         <w:r>
           <w:rPr>
             <w:rStyle w:val="Hyperlink"/>
@@ -371,7 +605,13 @@
         <w:t>in Kearney, Nebraska.</w:t>
       </w:r>
       <w:r>
-        <w:t xml:space="preserve"> Soils were sampled for both mineral and biological activity, once in the spring and once in the fall. </w:t>
+        <w:t xml:space="preserve"> Soils </w:t>
+      </w:r>
+      <w:r>
+        <w:t xml:space="preserve">analysis is undertaken </w:t>
+      </w:r>
+      <w:r>
+        <w:t xml:space="preserve">for both mineral and biological activity, once in the spring and once in the fall. </w:t>
       </w:r>
     </w:p>
     <w:p>
@@ -380,7 +620,6 @@
         <w:keepNext/>
       </w:pPr>
       <w:r>
-        <w:lastRenderedPageBreak/>
         <w:t xml:space="preserve">Table </w:t>
       </w:r>
       <w:fldSimple w:instr=" SEQ Table \* ARABIC ">
@@ -474,6 +713,28 @@
           </w:p>
         </w:tc>
       </w:tr>
+      <w:tr>
+        <w:tc>
+          <w:tcPr>
+            <w:tcW w:w="4675" w:type="dxa"/>
+          </w:tcPr>
+          <w:p>
+            <w:r>
+              <w:t>2026</w:t>
+            </w:r>
+          </w:p>
+        </w:tc>
+        <w:tc>
+          <w:tcPr>
+            <w:tcW w:w="4675" w:type="dxa"/>
+          </w:tcPr>
+          <w:p>
+            <w:r>
+              <w:t xml:space="preserve">June 28, </w:t>
+            </w:r>
+          </w:p>
+        </w:tc>
+      </w:tr>
     </w:tbl>
     <w:p>
       <w:pPr>
@@ -488,10 +749,25 @@
     </w:p>
     <w:p>
       <w:r>
-        <w:t>The Ward Labs fertilizer recommendations based on the soil samples for each strip were followed.</w:t>
-      </w:r>
-      <w:r>
-        <w:t xml:space="preserve"> Data on timing and quantity are available on the Bulk Downloads tab.</w:t>
+        <w:t>The Ward Labs fertilizer recommendations based on the soil samples for each strip were followed</w:t>
+      </w:r>
+      <w:r>
+        <w:t>, with a spring application. The</w:t>
+      </w:r>
+      <w:r>
+        <w:t xml:space="preserve"> quantity</w:t>
+      </w:r>
+      <w:r>
+        <w:t xml:space="preserve"> information is</w:t>
+      </w:r>
+      <w:r>
+        <w:t xml:space="preserve"> available </w:t>
+      </w:r>
+      <w:r>
+        <w:t>from</w:t>
+      </w:r>
+      <w:r>
+        <w:t xml:space="preserve"> the Bulk Downloads tab.</w:t>
       </w:r>
     </w:p>
     <w:p>
@@ -505,22 +781,42 @@
           <w:sz w:val="32"/>
           <w:szCs w:val="32"/>
         </w:rPr>
+        <w:lastRenderedPageBreak/>
         <w:t>Yield quality and quantity measurements</w:t>
       </w:r>
     </w:p>
     <w:p>
-      <w:r>
-        <w:t>Grasses were harvested three times a season in each of the four strips with measurements on dried biomass content and analyzed for nutrient composition by strip (Pasture Quality Metrics and Biomass (Field Samples) tabs</w:t>
+      <w:pPr>
+        <w:keepNext/>
+        <w:keepLines/>
+      </w:pPr>
+      <w:r>
+        <w:t>Grasses were harvested t</w:t>
+      </w:r>
+      <w:r>
+        <w:t>wo to t</w:t>
+      </w:r>
+      <w:r>
+        <w:t>hree times a season in each of the four strips with measurements on dried biomass content and analyzed for nutrient composition by strip (Pasture Quality Metrics</w:t>
+      </w:r>
+      <w:r>
+        <w:t>)</w:t>
+      </w:r>
+      <w:r>
+        <w:t xml:space="preserve"> and Biomass (Field Samples) tabs</w:t>
+      </w:r>
+      <w:r>
+        <w:t>)</w:t>
       </w:r>
       <w:r>
         <w:t>.</w:t>
       </w:r>
-      <w:r>
-        <w:br/>
-      </w:r>
-      <w:r>
-        <w:br/>
-      </w:r>
+    </w:p>
+    <w:p>
+      <w:pPr>
+        <w:keepNext/>
+        <w:keepLines/>
+      </w:pPr>
       <w:r>
         <w:rPr>
           <w:rStyle w:val="Heading1Char"/>
@@ -532,8 +828,18 @@
       </w:r>
     </w:p>
     <w:p>
-      <w:r>
-        <w:t>Soil samples were collected in each strip twice a year, in the spring and fall. The data were sent to Ward Labs for testing for both chemical composition and biological activity (Soil Biological Health and Soil Chemistry tabs. As with all the data presented here, these data can be downloaded using the Bulk Downloads tab.</w:t>
+      <w:pPr>
+        <w:keepNext/>
+        <w:keepLines/>
+      </w:pPr>
+      <w:r>
+        <w:t>Soil samples were collected in each strip twice a year, in the spring and fall. The data were sent to Ward Labs for testing for both chemical composition and biological activity (Soil Biological Health and Soil Chemistry tabs</w:t>
+      </w:r>
+      <w:r>
+        <w:t>)</w:t>
+      </w:r>
+      <w:r>
+        <w:t>. As with all the data presented here, these data can be downloaded using the Bulk Downloads tab.</w:t>
       </w:r>
     </w:p>
     <w:sectPr>
@@ -547,7 +853,7 @@
 </file>
 
 <file path=word/styles.xml><?xml version="1.0" encoding="utf-8"?>
-<w:styles xmlns:mc="http://schemas.openxmlformats.org/markup-compatibility/2006" xmlns:r="http://schemas.openxmlformats.org/officeDocument/2006/relationships" xmlns:w="http://schemas.openxmlformats.org/wordprocessingml/2006/main" xmlns:w14="http://schemas.microsoft.com/office/word/2010/wordml" xmlns:w15="http://schemas.microsoft.com/office/word/2012/wordml" xmlns:w16cex="http://schemas.microsoft.com/office/word/2018/wordml/cex" xmlns:w16cid="http://schemas.microsoft.com/office/word/2016/wordml/cid" xmlns:w16="http://schemas.microsoft.com/office/word/2018/wordml" xmlns:w16du="http://schemas.microsoft.com/office/word/2023/wordml/word16du" xmlns:w16sdtdh="http://schemas.microsoft.com/office/word/2020/wordml/sdtdatahash" xmlns:w16sdtfl="http://schemas.microsoft.com/office/word/2024/wordml/sdtformatlock" xmlns:w16se="http://schemas.microsoft.com/office/word/2015/wordml/symex" mc:Ignorable="w14 w15 w16se w16cid w16 w16cex w16sdtdh w16sdtfl w16du">
+<w:styles xmlns:mc="http://schemas.openxmlformats.org/markup-compatibility/2006" xmlns:r="http://schemas.openxmlformats.org/officeDocument/2006/relationships" xmlns:w="http://schemas.openxmlformats.org/wordprocessingml/2006/main" xmlns:w14="http://schemas.microsoft.com/office/word/2010/wordml" xmlns:w15="http://schemas.microsoft.com/office/word/2012/wordml" xmlns:w16cex="http://schemas.microsoft.com/office/word/2018/wordml/cex" xmlns:w16cid="http://schemas.microsoft.com/office/word/2016/wordml/cid" xmlns:w16="http://schemas.microsoft.com/office/word/2018/wordml" xmlns:w16sdtdh="http://schemas.microsoft.com/office/word/2020/wordml/sdtdatahash" xmlns:w16sdtfl="http://schemas.microsoft.com/office/word/2024/wordml/sdtformatlock" xmlns:w16se="http://schemas.microsoft.com/office/word/2015/wordml/symex" xmlns:w16du="http://schemas.microsoft.com/office/word/2023/wordml/word16du" mc:Ignorable="w14 w15 w16se w16cid w16 w16cex w16sdtdh w16sdtfl w16du">
   <w:docDefaults>
     <w:rPrDefault>
       <w:rPr>
@@ -1155,7 +1461,6 @@
   <w:style w:type="character" w:default="1" w:styleId="DefaultParagraphFont">
     <w:name w:val="Default Paragraph Font"/>
     <w:uiPriority w:val="1"/>
-    <w:semiHidden/>
     <w:unhideWhenUsed/>
   </w:style>
   <w:style w:type="table" w:default="1" w:styleId="TableNormal">

</xml_diff>